<commit_message>
Embed figures in the manuscript file for single-file submission
Co-Authored-By: Claude Opus 5.5 <noreply@anthropic.com>
Claude-Session: https://claude.ai/code/session_01HkfqEmJsfG521CNZGXo2WH
</commit_message>
<xml_diff>
--- a/manuscript/build/manuscript.docx
+++ b/manuscript/build/manuscript.docx
@@ -1725,18 +1725,65 @@
       </w:r>
     </w:p>
     <w:bookmarkEnd w:id="53"/>
-    <w:bookmarkStart w:id="54" w:name="figure-legends"/>
+    <w:bookmarkStart w:id="60" w:name="figures"/>
     <w:p>
       <w:pPr>
         <w:pStyle w:val="Heading1"/>
       </w:pPr>
       <w:r>
-        <w:t xml:space="preserve">Figure legends</w:t>
+        <w:t xml:space="preserve">Figures</w:t>
       </w:r>
     </w:p>
     <w:p>
       <w:pPr>
         <w:pStyle w:val="FirstParagraph"/>
+      </w:pPr>
+      <w:r>
+        <w:drawing>
+          <wp:inline>
+            <wp:extent cx="5302908" cy="2229423"/>
+            <wp:effectExtent b="0" l="0" r="0" t="0"/>
+            <wp:docPr descr="" title="" id="55" name="Picture"/>
+            <a:graphic>
+              <a:graphicData uri="http://schemas.openxmlformats.org/drawingml/2006/picture">
+                <pic:pic>
+                  <pic:nvPicPr>
+                    <pic:cNvPr descr="fig1_model.png" id="56" name="Picture"/>
+                    <pic:cNvPicPr>
+                      <a:picLocks noChangeArrowheads="1" noChangeAspect="1"/>
+                    </pic:cNvPicPr>
+                  </pic:nvPicPr>
+                  <pic:blipFill>
+                    <a:blip r:embed="rId54"/>
+                    <a:stretch>
+                      <a:fillRect/>
+                    </a:stretch>
+                  </pic:blipFill>
+                  <pic:spPr bwMode="auto">
+                    <a:xfrm>
+                      <a:off x="0" y="0"/>
+                      <a:ext cx="5302908" cy="2229423"/>
+                    </a:xfrm>
+                    <a:prstGeom prst="rect">
+                      <a:avLst/>
+                    </a:prstGeom>
+                    <a:noFill/>
+                    <a:ln w="9525">
+                      <a:noFill/>
+                      <a:headEnd/>
+                      <a:tailEnd/>
+                    </a:ln>
+                  </pic:spPr>
+                </pic:pic>
+              </a:graphicData>
+            </a:graphic>
+          </wp:inline>
+        </w:drawing>
+      </w:r>
+    </w:p>
+    <w:p>
+      <w:pPr>
+        <w:pStyle w:val="BodyText"/>
       </w:pPr>
       <w:r>
         <w:rPr>
@@ -1757,6 +1804,53 @@
         <w:pStyle w:val="BodyText"/>
       </w:pPr>
       <w:r>
+        <w:drawing>
+          <wp:inline>
+            <wp:extent cx="5334000" cy="3088630"/>
+            <wp:effectExtent b="0" l="0" r="0" t="0"/>
+            <wp:docPr descr="" title="" id="58" name="Picture"/>
+            <a:graphic>
+              <a:graphicData uri="http://schemas.openxmlformats.org/drawingml/2006/picture">
+                <pic:pic>
+                  <pic:nvPicPr>
+                    <pic:cNvPr descr="fig2_item_distributions.png" id="59" name="Picture"/>
+                    <pic:cNvPicPr>
+                      <a:picLocks noChangeArrowheads="1" noChangeAspect="1"/>
+                    </pic:cNvPicPr>
+                  </pic:nvPicPr>
+                  <pic:blipFill>
+                    <a:blip r:embed="rId57"/>
+                    <a:stretch>
+                      <a:fillRect/>
+                    </a:stretch>
+                  </pic:blipFill>
+                  <pic:spPr bwMode="auto">
+                    <a:xfrm>
+                      <a:off x="0" y="0"/>
+                      <a:ext cx="5334000" cy="3088630"/>
+                    </a:xfrm>
+                    <a:prstGeom prst="rect">
+                      <a:avLst/>
+                    </a:prstGeom>
+                    <a:noFill/>
+                    <a:ln w="9525">
+                      <a:noFill/>
+                      <a:headEnd/>
+                      <a:tailEnd/>
+                    </a:ln>
+                  </pic:spPr>
+                </pic:pic>
+              </a:graphicData>
+            </a:graphic>
+          </wp:inline>
+        </w:drawing>
+      </w:r>
+    </w:p>
+    <w:p>
+      <w:pPr>
+        <w:pStyle w:val="BodyText"/>
+      </w:pPr>
+      <w:r>
         <w:rPr>
           <w:bCs/>
           <w:b/>
@@ -1808,8 +1902,8 @@
         <w:t xml:space="preserve">); 207 of 416 respondents rated every item 7.</w:t>
       </w:r>
     </w:p>
-    <w:bookmarkEnd w:id="54"/>
-    <w:bookmarkStart w:id="55" w:name="tables"/>
+    <w:bookmarkEnd w:id="60"/>
+    <w:bookmarkStart w:id="61" w:name="tables"/>
     <w:p>
       <w:pPr>
         <w:pStyle w:val="Heading1"/>
@@ -8069,8 +8163,8 @@
         <w:t xml:space="preserve">Screened respondents: excludes 74 respondents who answered before the eligibility question was added. Straight-liners: identical answers to all 20 items. Repeat profiles: submissions identical to an earlier one on all demographic fields, job title and items. In the method-factor model all items load equally on an orthogonal method factor (mean standardised loading 0.78); this model did not converge after excluding straight-liners. In the reverse-order model, a is SP → IR, b is IR → CD and c′ is SP → CD; it is statistically equivalent to the hypothesised model. In the merged model, a is SP → combined factor. CIs are 95% Monte Carlo intervals (20,000 draws).</w:t>
       </w:r>
     </w:p>
-    <w:bookmarkEnd w:id="55"/>
-    <w:bookmarkStart w:id="56" w:name="additional-files"/>
+    <w:bookmarkEnd w:id="61"/>
+    <w:bookmarkStart w:id="62" w:name="additional-files"/>
     <w:p>
       <w:pPr>
         <w:pStyle w:val="Heading1"/>
@@ -8133,7 +8227,7 @@
         <w:t xml:space="preserve">(.docx): CHERRIES checklist for web-based surveys.</w:t>
       </w:r>
     </w:p>
-    <w:bookmarkEnd w:id="56"/>
+    <w:bookmarkEnd w:id="62"/>
     <w:sectPr>
       <w:footerReference w:type="default" r:id="rId9"/>
       <w:lnNumType w:countBy="1" w:restart="continuous"/>

</xml_diff>

<commit_message>
Add ESLSCA University affiliation; align author contributions with SNAPP
Co-Authored-By: Claude Opus 5.5 <noreply@anthropic.com>
Claude-Session: https://claude.ai/code/session_01HkfqEmJsfG521CNZGXo2WH
</commit_message>
<xml_diff>
--- a/manuscript/build/manuscript.docx
+++ b/manuscript/build/manuscript.docx
@@ -157,7 +157,7 @@
         <w:rPr>
           <w:vertAlign w:val="superscript"/>
         </w:rPr>
-        <w:t xml:space="preserve">1*</w:t>
+        <w:t xml:space="preserve">1,2*</w:t>
       </w:r>
       <w:r>
         <w:t xml:space="preserve"> </w:t>
@@ -210,6 +210,23 @@
         <w:pStyle w:val="BodyText"/>
       </w:pPr>
       <w:r>
+        <w:rPr>
+          <w:vertAlign w:val="superscript"/>
+        </w:rPr>
+        <w:t xml:space="preserve">2</w:t>
+      </w:r>
+      <w:r>
+        <w:t xml:space="preserve"> </w:t>
+      </w:r>
+      <w:r>
+        <w:t xml:space="preserve">ESLSCA University, Cairo, Egypt</w:t>
+      </w:r>
+    </w:p>
+    <w:p>
+      <w:pPr>
+        <w:pStyle w:val="BodyText"/>
+      </w:pPr>
+      <w:r>
         <w:t xml:space="preserve">*Corresponding author: Ahmed Hamza, ahmed.hamza@esri.usc.edu.eg</w:t>
       </w:r>
     </w:p>
@@ -1200,7 +1217,7 @@
         <w:pStyle w:val="FirstParagraph"/>
       </w:pPr>
       <w:r>
-        <w:t xml:space="preserve">AH: conceptualisation, methodology, questionnaire development, investigation (data collection), data curation, formal analysis, visualisation, writing (original draft). MSA: supervision, methodology, validation, writing (review and editing). Both authors read and approved the final manuscript.</w:t>
+        <w:t xml:space="preserve">A.H. conceived the study, developed the conceptual framework and questionnaire, collected and curated the data, performed the formal analysis, prepared the figures and wrote the original draft of the manuscript. M.S.A. supervised the research, contributed to the methodology and validation of the analysis, and reviewed and edited the manuscript. All authors read and approved the final manuscript.</w:t>
       </w:r>
     </w:p>
     <w:bookmarkEnd w:id="50"/>

</xml_diff>

<commit_message>
Move STROBE and CHERRIES checklists out of the published additional files
Requested by the BMC Health Services Research technical check: the
checklists are submitted as related files for the editor, and the
manuscript no longer cites them as Additional files 2 and 3.
</commit_message>
<xml_diff>
--- a/manuscript/build/manuscript.docx
+++ b/manuscript/build/manuscript.docx
@@ -492,7 +492,7 @@
         <w:pStyle w:val="FirstParagraph"/>
       </w:pPr>
       <w:r>
-        <w:t xml:space="preserve">This was a cross-sectional, web-based survey. Reporting follows the STROBE statement for cross-sectional studies [29] and the Checklist for Reporting Results of Internet E-Surveys (CHERRIES) [30] (Additional files 2 and 3).</w:t>
+        <w:t xml:space="preserve">This was a cross-sectional, web-based survey. Reporting follows the STROBE statement for cross-sectional studies [29] and the Checklist for Reporting Results of Internet E-Surveys (CHERRIES) [30].</w:t>
       </w:r>
     </w:p>
     <w:bookmarkEnd w:id="23"/>
@@ -8189,42 +8189,6 @@
       </w:r>
       <w:r>
         <w:t xml:space="preserve">(.docx): Supplementary tables. Table S1, sample flow; Table S2, questionnaire items in English and Arabic; Table S3, item statistics and standardised loadings; Table S4, response-style diagnostics and Harman single-factor test; Table S5, observed-score mediation in all analysis samples.</w:t>
-      </w:r>
-    </w:p>
-    <w:p>
-      <w:pPr>
-        <w:pStyle w:val="BodyText"/>
-      </w:pPr>
-      <w:r>
-        <w:rPr>
-          <w:bCs/>
-          <w:b/>
-        </w:rPr>
-        <w:t xml:space="preserve">Additional file 2</w:t>
-      </w:r>
-      <w:r>
-        <w:t xml:space="preserve"> </w:t>
-      </w:r>
-      <w:r>
-        <w:t xml:space="preserve">(.docx): STROBE checklist for cross-sectional studies.</w:t>
-      </w:r>
-    </w:p>
-    <w:p>
-      <w:pPr>
-        <w:pStyle w:val="BodyText"/>
-      </w:pPr>
-      <w:r>
-        <w:rPr>
-          <w:bCs/>
-          <w:b/>
-        </w:rPr>
-        <w:t xml:space="preserve">Additional file 3</w:t>
-      </w:r>
-      <w:r>
-        <w:t xml:space="preserve"> </w:t>
-      </w:r>
-      <w:r>
-        <w:t xml:space="preserve">(.docx): CHERRIES checklist for web-based surveys.</w:t>
       </w:r>
     </w:p>
     <w:bookmarkEnd w:id="62"/>

</xml_diff>